<commit_message>
v2.0.1: persistent soft-keyboard toggle + tighter README + label refresh
- Fix: soft keyboard hide is now persistent across re-focus / sleep / wake
  (replaces empty View instead of returning null, defeats the
  show_ime_with_hard_keyboard=1 force-show on this device).
- README slimmed; detailed RE write-up moved to FINAL_REPORT.md link.
- Label regenerated with note that double-tap-space hide is persistent.
- versionCode 3, versionName 2.0.1.
</commit_message>
<xml_diff>
--- a/dist/WAREHOUSE_LABEL_RU.docx
+++ b/dist/WAREHOUSE_LABEL_RU.docx
@@ -68,7 +68,20 @@
           <w:color w:val="C00000"/>
           <w:sz w:val="22"/>
         </w:rPr>
-        <w:t>⌨ Двойной ПРОБЕЛ (быстро) → показать/скрыть экранную клавиатуру</w:t>
+        <w:t>⌨ Двойной ПРОБЕЛ (быстро) → показать / скрыть экранную клавиатуру</w:t>
+      </w:r>
+    </w:p>
+    <w:p>
+      <w:pPr>
+        <w:jc w:val="center"/>
+      </w:pPr>
+      <w:r>
+        <w:rPr>
+          <w:rFonts w:ascii="Calibri" w:hAnsi="Calibri" w:cs="Calibri"/>
+          <w:b w:val="0"/>
+          <w:sz w:val="18"/>
+        </w:rPr>
+        <w:t>(настройка экранной клавиатуры запоминается, в т.ч. после сна)</w:t>
       </w:r>
     </w:p>
     <w:p/>
@@ -2248,6 +2261,16 @@
         <w:t>• Экранная клавиатура: ЙЦУКЕН + QWERTY, переключатель «РУ/EN» внизу слева.</w:t>
       </w:r>
     </w:p>
+    <w:p>
+      <w:r>
+        <w:rPr>
+          <w:rFonts w:ascii="Calibri" w:hAnsi="Calibri" w:cs="Calibri"/>
+          <w:b w:val="0"/>
+          <w:sz w:val="18"/>
+        </w:rPr>
+        <w:t>• Если выключили двойным пробелом — она останется выключенной до следующего двойного пробела.</w:t>
+      </w:r>
+    </w:p>
     <w:sectPr>
       <w:pgSz w:w="12240" w:h="15840"/>
       <w:pgMar w:top="567" w:right="680" w:bottom="567" w:left="680" w:header="720" w:footer="720" w:gutter="0"/>

</xml_diff>